<commit_message>
upload jobsheet 3 A & B
</commit_message>
<xml_diff>
--- a/09_Evan Diantha Fafian/Jobsheet 3 Database Analytical/laporan/Jobsheet 3 - Data Warehouse - Database Analytical.docx
+++ b/09_Evan Diantha Fafian/Jobsheet 3 Database Analytical/laporan/Jobsheet 3 - Data Warehouse - Database Analytical.docx
@@ -8993,20 +8993,99 @@
     </w:p>
     <w:p>
       <w:pPr>
-        <w:rPr>
-          <w:rFonts w:asciiTheme="minorHAnsi" w:hAnsiTheme="minorHAnsi" w:cstheme="minorHAnsi"/>
-          <w:sz w:val="24"/>
-          <w:szCs w:val="24"/>
-          <w:lang w:val="en-ID"/>
-        </w:rPr>
-      </w:pPr>
-      <w:r>
-        <w:rPr>
-          <w:rFonts w:asciiTheme="minorHAnsi" w:hAnsiTheme="minorHAnsi" w:cstheme="minorHAnsi"/>
-          <w:sz w:val="24"/>
-          <w:szCs w:val="24"/>
-          <w:lang w:val="en-ID"/>
-        </w:rPr>
+        <w:jc w:val="center"/>
+        <w:rPr>
+          <w:rFonts w:asciiTheme="minorHAnsi" w:hAnsiTheme="minorHAnsi" w:cstheme="minorHAnsi"/>
+          <w:sz w:val="24"/>
+          <w:szCs w:val="24"/>
+          <w:lang w:val="en-ID"/>
+        </w:rPr>
+      </w:pPr>
+      <w:r>
+        <w:rPr>
+          <w:rFonts w:asciiTheme="minorHAnsi" w:hAnsiTheme="minorHAnsi" w:cstheme="minorHAnsi"/>
+          <w:sz w:val="24"/>
+          <w:szCs w:val="24"/>
+          <w:lang w:val="en-ID"/>
+        </w:rPr>
+        <w:lastRenderedPageBreak/>
+        <w:drawing>
+          <wp:inline distT="0" distB="0" distL="0" distR="0" wp14:anchorId="024BBEBB" wp14:editId="732F1726">
+            <wp:extent cx="5731510" cy="3223895"/>
+            <wp:effectExtent l="0" t="0" r="2540" b="0"/>
+            <wp:docPr id="1904666780" name="Picture 1"/>
+            <wp:cNvGraphicFramePr>
+              <a:graphicFrameLocks xmlns:a="http://schemas.openxmlformats.org/drawingml/2006/main" noChangeAspect="1"/>
+            </wp:cNvGraphicFramePr>
+            <a:graphic xmlns:a="http://schemas.openxmlformats.org/drawingml/2006/main">
+              <a:graphicData uri="http://schemas.openxmlformats.org/drawingml/2006/picture">
+                <pic:pic xmlns:pic="http://schemas.openxmlformats.org/drawingml/2006/picture">
+                  <pic:nvPicPr>
+                    <pic:cNvPr id="1904666780" name=""/>
+                    <pic:cNvPicPr/>
+                  </pic:nvPicPr>
+                  <pic:blipFill>
+                    <a:blip r:embed="rId19"/>
+                    <a:stretch>
+                      <a:fillRect/>
+                    </a:stretch>
+                  </pic:blipFill>
+                  <pic:spPr>
+                    <a:xfrm>
+                      <a:off x="0" y="0"/>
+                      <a:ext cx="5731510" cy="3223895"/>
+                    </a:xfrm>
+                    <a:prstGeom prst="rect">
+                      <a:avLst/>
+                    </a:prstGeom>
+                  </pic:spPr>
+                </pic:pic>
+              </a:graphicData>
+            </a:graphic>
+          </wp:inline>
+        </w:drawing>
+      </w:r>
+    </w:p>
+    <w:p>
+      <w:pPr>
+        <w:widowControl/>
+        <w:autoSpaceDE/>
+        <w:autoSpaceDN/>
+        <w:spacing w:after="160" w:line="259" w:lineRule="auto"/>
+        <w:rPr>
+          <w:rFonts w:asciiTheme="minorHAnsi" w:hAnsiTheme="minorHAnsi" w:cstheme="minorHAnsi"/>
+          <w:sz w:val="24"/>
+          <w:szCs w:val="24"/>
+          <w:lang w:val="en-ID"/>
+        </w:rPr>
+      </w:pPr>
+      <w:r>
+        <w:rPr>
+          <w:rFonts w:asciiTheme="minorHAnsi" w:hAnsiTheme="minorHAnsi" w:cstheme="minorHAnsi"/>
+          <w:sz w:val="24"/>
+          <w:szCs w:val="24"/>
+          <w:lang w:val="en-ID"/>
+        </w:rPr>
+        <w:br w:type="page"/>
+      </w:r>
+    </w:p>
+    <w:p>
+      <w:pPr>
+        <w:rPr>
+          <w:rFonts w:asciiTheme="minorHAnsi" w:hAnsiTheme="minorHAnsi" w:cstheme="minorHAnsi"/>
+          <w:sz w:val="24"/>
+          <w:szCs w:val="24"/>
+          <w:lang w:val="en-ID"/>
+        </w:rPr>
+      </w:pPr>
+      <w:r>
+        <w:rPr>
+          <w:rFonts w:asciiTheme="minorHAnsi" w:hAnsiTheme="minorHAnsi" w:cstheme="minorHAnsi"/>
+          <w:sz w:val="24"/>
+          <w:szCs w:val="24"/>
+          <w:lang w:val="en-ID"/>
+        </w:rPr>
+        <w:lastRenderedPageBreak/>
         <w:pict w14:anchorId="30AAF274">
           <v:rect id="_x0000_i1119" style="width:8in;height:0" o:hrpct="0" o:hralign="center" o:hrstd="t" o:hr="t" fillcolor="#a0a0a0" stroked="f"/>
         </w:pict>
@@ -9030,7 +9109,6 @@
           <w:szCs w:val="24"/>
           <w:lang w:val="en-ID"/>
         </w:rPr>
-        <w:lastRenderedPageBreak/>
         <w:t>TUGAS 1</w:t>
       </w:r>
     </w:p>
@@ -9289,7 +9367,7 @@
                     <pic:cNvPicPr/>
                   </pic:nvPicPr>
                   <pic:blipFill>
-                    <a:blip r:embed="rId19"/>
+                    <a:blip r:embed="rId20"/>
                     <a:stretch>
                       <a:fillRect/>
                     </a:stretch>
@@ -9312,6 +9390,59 @@
     </w:p>
     <w:p>
       <w:pPr>
+        <w:rPr>
+          <w:rFonts w:asciiTheme="minorHAnsi" w:hAnsiTheme="minorHAnsi" w:cstheme="minorHAnsi"/>
+          <w:sz w:val="24"/>
+          <w:szCs w:val="24"/>
+          <w:lang w:val="sv-SE"/>
+        </w:rPr>
+      </w:pPr>
+      <w:r>
+        <w:rPr>
+          <w:rFonts w:asciiTheme="minorHAnsi" w:hAnsiTheme="minorHAnsi" w:cstheme="minorHAnsi"/>
+          <w:sz w:val="24"/>
+          <w:szCs w:val="24"/>
+          <w:lang w:val="sv-SE"/>
+        </w:rPr>
+        <w:drawing>
+          <wp:inline distT="0" distB="0" distL="0" distR="0" wp14:anchorId="5F8272FF" wp14:editId="45568C71">
+            <wp:extent cx="5731510" cy="3223895"/>
+            <wp:effectExtent l="0" t="0" r="2540" b="0"/>
+            <wp:docPr id="1742581284" name="Picture 1"/>
+            <wp:cNvGraphicFramePr>
+              <a:graphicFrameLocks xmlns:a="http://schemas.openxmlformats.org/drawingml/2006/main" noChangeAspect="1"/>
+            </wp:cNvGraphicFramePr>
+            <a:graphic xmlns:a="http://schemas.openxmlformats.org/drawingml/2006/main">
+              <a:graphicData uri="http://schemas.openxmlformats.org/drawingml/2006/picture">
+                <pic:pic xmlns:pic="http://schemas.openxmlformats.org/drawingml/2006/picture">
+                  <pic:nvPicPr>
+                    <pic:cNvPr id="1742581284" name=""/>
+                    <pic:cNvPicPr/>
+                  </pic:nvPicPr>
+                  <pic:blipFill>
+                    <a:blip r:embed="rId21"/>
+                    <a:stretch>
+                      <a:fillRect/>
+                    </a:stretch>
+                  </pic:blipFill>
+                  <pic:spPr>
+                    <a:xfrm>
+                      <a:off x="0" y="0"/>
+                      <a:ext cx="5731510" cy="3223895"/>
+                    </a:xfrm>
+                    <a:prstGeom prst="rect">
+                      <a:avLst/>
+                    </a:prstGeom>
+                  </pic:spPr>
+                </pic:pic>
+              </a:graphicData>
+            </a:graphic>
+          </wp:inline>
+        </w:drawing>
+      </w:r>
+    </w:p>
+    <w:p>
+      <w:pPr>
         <w:widowControl/>
         <w:autoSpaceDE/>
         <w:autoSpaceDN/>
@@ -9481,7 +9612,7 @@
                     <pic:cNvPicPr/>
                   </pic:nvPicPr>
                   <pic:blipFill>
-                    <a:blip r:embed="rId20"/>
+                    <a:blip r:embed="rId22"/>
                     <a:stretch>
                       <a:fillRect/>
                     </a:stretch>
@@ -9621,7 +9752,7 @@
                     </pic:cNvPicPr>
                   </pic:nvPicPr>
                   <pic:blipFill>
-                    <a:blip r:embed="rId21">
+                    <a:blip r:embed="rId23">
                       <a:extLst>
                         <a:ext uri="{28A0092B-C50C-407E-A947-70E740481C1C}">
                           <a14:useLocalDpi xmlns:a14="http://schemas.microsoft.com/office/drawing/2010/main" val="0"/>
@@ -10511,7 +10642,7 @@
                     </pic:cNvPicPr>
                   </pic:nvPicPr>
                   <pic:blipFill>
-                    <a:blip r:embed="rId22">
+                    <a:blip r:embed="rId24">
                       <a:extLst>
                         <a:ext uri="{28A0092B-C50C-407E-A947-70E740481C1C}">
                           <a14:useLocalDpi xmlns:a14="http://schemas.microsoft.com/office/drawing/2010/main" val="0"/>
@@ -10833,7 +10964,7 @@
                     <pic:cNvPicPr/>
                   </pic:nvPicPr>
                   <pic:blipFill>
-                    <a:blip r:embed="rId23"/>
+                    <a:blip r:embed="rId25"/>
                     <a:stretch>
                       <a:fillRect/>
                     </a:stretch>
@@ -10889,7 +11020,7 @@
                     </pic:cNvPicPr>
                   </pic:nvPicPr>
                   <pic:blipFill>
-                    <a:blip r:embed="rId24">
+                    <a:blip r:embed="rId26">
                       <a:extLst>
                         <a:ext uri="{28A0092B-C50C-407E-A947-70E740481C1C}">
                           <a14:useLocalDpi xmlns:a14="http://schemas.microsoft.com/office/drawing/2010/main" val="0"/>
@@ -11469,7 +11600,7 @@
                     </pic:cNvPicPr>
                   </pic:nvPicPr>
                   <pic:blipFill>
-                    <a:blip r:embed="rId25">
+                    <a:blip r:embed="rId27">
                       <a:extLst>
                         <a:ext uri="{28A0092B-C50C-407E-A947-70E740481C1C}">
                           <a14:useLocalDpi xmlns:a14="http://schemas.microsoft.com/office/drawing/2010/main" val="0"/>
@@ -11576,7 +11707,7 @@
                     </pic:cNvPicPr>
                   </pic:nvPicPr>
                   <pic:blipFill>
-                    <a:blip r:embed="rId26">
+                    <a:blip r:embed="rId28">
                       <a:extLst>
                         <a:ext uri="{28A0092B-C50C-407E-A947-70E740481C1C}">
                           <a14:useLocalDpi xmlns:a14="http://schemas.microsoft.com/office/drawing/2010/main" val="0"/>
@@ -12316,7 +12447,7 @@
                     </pic:cNvPicPr>
                   </pic:nvPicPr>
                   <pic:blipFill>
-                    <a:blip r:embed="rId27">
+                    <a:blip r:embed="rId29">
                       <a:extLst>
                         <a:ext uri="{28A0092B-C50C-407E-A947-70E740481C1C}">
                           <a14:useLocalDpi xmlns:a14="http://schemas.microsoft.com/office/drawing/2010/main" val="0"/>
@@ -12881,7 +13012,7 @@
                     </pic:cNvPicPr>
                   </pic:nvPicPr>
                   <pic:blipFill>
-                    <a:blip r:embed="rId28">
+                    <a:blip r:embed="rId30">
                       <a:extLst>
                         <a:ext uri="{28A0092B-C50C-407E-A947-70E740481C1C}">
                           <a14:useLocalDpi xmlns:a14="http://schemas.microsoft.com/office/drawing/2010/main" val="0"/>
@@ -13439,7 +13570,7 @@
                     </pic:cNvPicPr>
                   </pic:nvPicPr>
                   <pic:blipFill>
-                    <a:blip r:embed="rId29">
+                    <a:blip r:embed="rId31">
                       <a:extLst>
                         <a:ext uri="{28A0092B-C50C-407E-A947-70E740481C1C}">
                           <a14:useLocalDpi xmlns:a14="http://schemas.microsoft.com/office/drawing/2010/main" val="0"/>
@@ -13763,7 +13894,7 @@
                     </pic:cNvPicPr>
                   </pic:nvPicPr>
                   <pic:blipFill>
-                    <a:blip r:embed="rId30">
+                    <a:blip r:embed="rId32">
                       <a:extLst>
                         <a:ext uri="{28A0092B-C50C-407E-A947-70E740481C1C}">
                           <a14:useLocalDpi xmlns:a14="http://schemas.microsoft.com/office/drawing/2010/main" val="0"/>
@@ -13848,20 +13979,99 @@
     </w:p>
     <w:p>
       <w:pPr>
-        <w:rPr>
-          <w:rFonts w:asciiTheme="minorHAnsi" w:hAnsiTheme="minorHAnsi" w:cstheme="minorHAnsi"/>
-          <w:sz w:val="24"/>
-          <w:szCs w:val="24"/>
-          <w:lang w:val="en-ID"/>
-        </w:rPr>
-      </w:pPr>
-      <w:r>
-        <w:rPr>
-          <w:rFonts w:asciiTheme="minorHAnsi" w:hAnsiTheme="minorHAnsi" w:cstheme="minorHAnsi"/>
-          <w:sz w:val="24"/>
-          <w:szCs w:val="24"/>
-          <w:lang w:val="en-ID"/>
-        </w:rPr>
+        <w:jc w:val="center"/>
+        <w:rPr>
+          <w:rFonts w:asciiTheme="minorHAnsi" w:hAnsiTheme="minorHAnsi" w:cstheme="minorHAnsi"/>
+          <w:sz w:val="24"/>
+          <w:szCs w:val="24"/>
+          <w:lang w:val="en-ID"/>
+        </w:rPr>
+      </w:pPr>
+      <w:r>
+        <w:rPr>
+          <w:rFonts w:asciiTheme="minorHAnsi" w:hAnsiTheme="minorHAnsi" w:cstheme="minorHAnsi"/>
+          <w:sz w:val="24"/>
+          <w:szCs w:val="24"/>
+          <w:lang w:val="en-ID"/>
+        </w:rPr>
+        <w:lastRenderedPageBreak/>
+        <w:drawing>
+          <wp:inline distT="0" distB="0" distL="0" distR="0" wp14:anchorId="4744818B" wp14:editId="56C2DF7E">
+            <wp:extent cx="5731510" cy="3223895"/>
+            <wp:effectExtent l="0" t="0" r="2540" b="0"/>
+            <wp:docPr id="762779067" name="Picture 1"/>
+            <wp:cNvGraphicFramePr>
+              <a:graphicFrameLocks xmlns:a="http://schemas.openxmlformats.org/drawingml/2006/main" noChangeAspect="1"/>
+            </wp:cNvGraphicFramePr>
+            <a:graphic xmlns:a="http://schemas.openxmlformats.org/drawingml/2006/main">
+              <a:graphicData uri="http://schemas.openxmlformats.org/drawingml/2006/picture">
+                <pic:pic xmlns:pic="http://schemas.openxmlformats.org/drawingml/2006/picture">
+                  <pic:nvPicPr>
+                    <pic:cNvPr id="762779067" name=""/>
+                    <pic:cNvPicPr/>
+                  </pic:nvPicPr>
+                  <pic:blipFill>
+                    <a:blip r:embed="rId33"/>
+                    <a:stretch>
+                      <a:fillRect/>
+                    </a:stretch>
+                  </pic:blipFill>
+                  <pic:spPr>
+                    <a:xfrm>
+                      <a:off x="0" y="0"/>
+                      <a:ext cx="5731510" cy="3223895"/>
+                    </a:xfrm>
+                    <a:prstGeom prst="rect">
+                      <a:avLst/>
+                    </a:prstGeom>
+                  </pic:spPr>
+                </pic:pic>
+              </a:graphicData>
+            </a:graphic>
+          </wp:inline>
+        </w:drawing>
+      </w:r>
+    </w:p>
+    <w:p>
+      <w:pPr>
+        <w:widowControl/>
+        <w:autoSpaceDE/>
+        <w:autoSpaceDN/>
+        <w:spacing w:after="160" w:line="259" w:lineRule="auto"/>
+        <w:rPr>
+          <w:rFonts w:asciiTheme="minorHAnsi" w:hAnsiTheme="minorHAnsi" w:cstheme="minorHAnsi"/>
+          <w:sz w:val="24"/>
+          <w:szCs w:val="24"/>
+          <w:lang w:val="en-ID"/>
+        </w:rPr>
+      </w:pPr>
+      <w:r>
+        <w:rPr>
+          <w:rFonts w:asciiTheme="minorHAnsi" w:hAnsiTheme="minorHAnsi" w:cstheme="minorHAnsi"/>
+          <w:sz w:val="24"/>
+          <w:szCs w:val="24"/>
+          <w:lang w:val="en-ID"/>
+        </w:rPr>
+        <w:br w:type="page"/>
+      </w:r>
+    </w:p>
+    <w:p>
+      <w:pPr>
+        <w:rPr>
+          <w:rFonts w:asciiTheme="minorHAnsi" w:hAnsiTheme="minorHAnsi" w:cstheme="minorHAnsi"/>
+          <w:sz w:val="24"/>
+          <w:szCs w:val="24"/>
+          <w:lang w:val="en-ID"/>
+        </w:rPr>
+      </w:pPr>
+      <w:r>
+        <w:rPr>
+          <w:rFonts w:asciiTheme="minorHAnsi" w:hAnsiTheme="minorHAnsi" w:cstheme="minorHAnsi"/>
+          <w:sz w:val="24"/>
+          <w:szCs w:val="24"/>
+          <w:lang w:val="en-ID"/>
+        </w:rPr>
+        <w:lastRenderedPageBreak/>
         <w:pict w14:anchorId="14A144BE">
           <v:rect id="_x0000_i1194" style="width:8in;height:0" o:hrpct="0" o:hralign="center" o:hrstd="t" o:hr="t" fillcolor="#a0a0a0" stroked="f"/>
         </w:pict>
@@ -13948,17 +14158,7 @@
           <w:szCs w:val="24"/>
           <w:lang w:val="en-ID"/>
         </w:rPr>
-        <w:t xml:space="preserve"> input dan </w:t>
-      </w:r>
-      <w:r>
-        <w:rPr>
-          <w:rFonts w:asciiTheme="minorHAnsi" w:hAnsiTheme="minorHAnsi" w:cstheme="minorHAnsi"/>
-          <w:sz w:val="24"/>
-          <w:szCs w:val="24"/>
-          <w:lang w:val="en-ID"/>
-        </w:rPr>
-        <w:lastRenderedPageBreak/>
-        <w:t xml:space="preserve">output data yang </w:t>
+        <w:t xml:space="preserve"> input dan output data yang </w:t>
       </w:r>
       <w:proofErr w:type="spellStart"/>
       <w:r>
@@ -14154,7 +14354,7 @@
                     <pic:cNvPicPr/>
                   </pic:nvPicPr>
                   <pic:blipFill>
-                    <a:blip r:embed="rId31"/>
+                    <a:blip r:embed="rId34"/>
                     <a:stretch>
                       <a:fillRect/>
                     </a:stretch>
@@ -14163,6 +14363,60 @@
                     <a:xfrm>
                       <a:off x="0" y="0"/>
                       <a:ext cx="5731510" cy="1850390"/>
+                    </a:xfrm>
+                    <a:prstGeom prst="rect">
+                      <a:avLst/>
+                    </a:prstGeom>
+                  </pic:spPr>
+                </pic:pic>
+              </a:graphicData>
+            </a:graphic>
+          </wp:inline>
+        </w:drawing>
+      </w:r>
+    </w:p>
+    <w:p>
+      <w:pPr>
+        <w:ind w:left="360"/>
+        <w:rPr>
+          <w:rFonts w:asciiTheme="minorHAnsi" w:hAnsiTheme="minorHAnsi" w:cstheme="minorHAnsi"/>
+          <w:sz w:val="24"/>
+          <w:szCs w:val="24"/>
+          <w:lang w:val="en-ID"/>
+        </w:rPr>
+      </w:pPr>
+      <w:r>
+        <w:rPr>
+          <w:rFonts w:asciiTheme="minorHAnsi" w:hAnsiTheme="minorHAnsi" w:cstheme="minorHAnsi"/>
+          <w:sz w:val="24"/>
+          <w:szCs w:val="24"/>
+          <w:lang w:val="en-ID"/>
+        </w:rPr>
+        <w:drawing>
+          <wp:inline distT="0" distB="0" distL="0" distR="0" wp14:anchorId="6080C784" wp14:editId="310D3D79">
+            <wp:extent cx="5731510" cy="3223895"/>
+            <wp:effectExtent l="0" t="0" r="2540" b="0"/>
+            <wp:docPr id="1317582575" name="Picture 1"/>
+            <wp:cNvGraphicFramePr>
+              <a:graphicFrameLocks xmlns:a="http://schemas.openxmlformats.org/drawingml/2006/main" noChangeAspect="1"/>
+            </wp:cNvGraphicFramePr>
+            <a:graphic xmlns:a="http://schemas.openxmlformats.org/drawingml/2006/main">
+              <a:graphicData uri="http://schemas.openxmlformats.org/drawingml/2006/picture">
+                <pic:pic xmlns:pic="http://schemas.openxmlformats.org/drawingml/2006/picture">
+                  <pic:nvPicPr>
+                    <pic:cNvPr id="1317582575" name=""/>
+                    <pic:cNvPicPr/>
+                  </pic:nvPicPr>
+                  <pic:blipFill>
+                    <a:blip r:embed="rId35"/>
+                    <a:stretch>
+                      <a:fillRect/>
+                    </a:stretch>
+                  </pic:blipFill>
+                  <pic:spPr>
+                    <a:xfrm>
+                      <a:off x="0" y="0"/>
+                      <a:ext cx="5731510" cy="3223895"/>
                     </a:xfrm>
                     <a:prstGeom prst="rect">
                       <a:avLst/>

</xml_diff>